<commit_message>
feat(csht): update all 8 target stations to MBF dau tu & fix contract address template format
</commit_message>
<xml_diff>
--- a/tvt3_v2/public/templates/HOP_DONG_MOI_MAT_BANG.docx
+++ b/tvt3_v2/public/templates/HOP_DONG_MOI_MAT_BANG.docx
@@ -856,44 +856,7 @@
         </w:rPr>
       </w:pPr>
       <w:r>
-        <w:rPr>
-          <w:rFonts w:ascii="Times New Roman" w:hAnsi="Times New Roman"/>
-          <w:szCs w:val="28"/>
-          <w:lang w:val="da-DK"/>
-        </w:rPr>
-        <w:t>{{ADDRESS_OLD</w:t>
-      </w:r>
-      <w:proofErr w:type="gramStart"/>
-      <w:r>
-        <w:rPr>
-          <w:rFonts w:ascii="Times New Roman" w:hAnsi="Times New Roman"/>
-          <w:szCs w:val="28"/>
-          <w:lang w:val="da-DK"/>
-        </w:rPr>
-        <w:t>}}</w:t>
-      </w:r>
-      <w:r>
-        <w:rPr>
-          <w:rStyle w:val="Emphasis"/>
-          <w:rFonts w:ascii="Times New Roman" w:hAnsi="Times New Roman"/>
-          <w:i w:val="0"/>
-          <w:iCs w:val="0"/>
-          <w:szCs w:val="28"/>
-          <w:lang w:val="da-DK"/>
-        </w:rPr>
-        <w:t>{</w:t>
-      </w:r>
-      <w:proofErr w:type="gramEnd"/>
-      <w:r>
-        <w:rPr>
-          <w:rStyle w:val="Emphasis"/>
-          <w:rFonts w:ascii="Times New Roman" w:hAnsi="Times New Roman"/>
-          <w:i w:val="0"/>
-          <w:iCs w:val="0"/>
-          <w:szCs w:val="28"/>
-          <w:lang w:val="da-DK"/>
-        </w:rPr>
-        <w:t>{ADDRESS_NEW}}</w:t>
+        <w:t>{{ADDRESS_OLD}} ({{ADDRESS_NEW}})</w:t>
       </w:r>
     </w:p>
     <w:p>

</xml_diff>